<commit_message>
Improve the readme file content and test reports
</commit_message>
<xml_diff>
--- a/Evidence/Test Report for CacheView with Form.docx
+++ b/Evidence/Test Report for CacheView with Form.docx
@@ -244,10 +244,10 @@
         <w:tblLook w:val="04A0" w:firstRow="1" w:lastRow="0" w:firstColumn="1" w:lastColumn="0" w:noHBand="0" w:noVBand="1"/>
       </w:tblPr>
       <w:tblGrid>
-        <w:gridCol w:w="2875"/>
-        <w:gridCol w:w="1799"/>
-        <w:gridCol w:w="2338"/>
-        <w:gridCol w:w="2338"/>
+        <w:gridCol w:w="2162"/>
+        <w:gridCol w:w="1192"/>
+        <w:gridCol w:w="1567"/>
+        <w:gridCol w:w="4429"/>
       </w:tblGrid>
       <w:tr>
         <w:tc>
@@ -495,7 +495,11 @@
           </w:tcPr>
           <w:p>
             <w:r>
-              <w:t>Both interactive components respond to a click on a warm load, incrementing their counters.</w:t>
+              <w:t xml:space="preserve">Both interactive components respond to a click on a warm load, </w:t>
+            </w:r>
+            <w:r>
+              <w:lastRenderedPageBreak/>
+              <w:t>incrementing their counters.</w:t>
             </w:r>
           </w:p>
         </w:tc>
@@ -505,6 +509,7 @@
           </w:tcPr>
           <w:p>
             <w:r>
+              <w:lastRenderedPageBreak/>
               <w:t>Pass</w:t>
             </w:r>
           </w:p>
@@ -542,11 +547,7 @@
           </w:tcPr>
           <w:p>
             <w:r>
-              <w:t xml:space="preserve">With prerendering enabled, the interactive children receive new </w:t>
-            </w:r>
-            <w:r>
-              <w:lastRenderedPageBreak/>
-              <w:t xml:space="preserve">prerender identifiers on a warm GET even though the surrounding cached child's </w:t>
+              <w:t xml:space="preserve">With prerendering enabled, the interactive children receive new prerender identifiers on a warm GET even though the surrounding cached child's </w:t>
             </w:r>
             <w:proofErr w:type="spellStart"/>
             <w:r>
@@ -564,7 +565,6 @@
           </w:tcPr>
           <w:p>
             <w:r>
-              <w:lastRenderedPageBreak/>
               <w:t>Pass</w:t>
             </w:r>
           </w:p>
@@ -640,6 +640,109 @@
               <w:t>-</w:t>
             </w:r>
           </w:p>
+        </w:tc>
+      </w:tr>
+      <w:tr>
+        <w:tc>
+          <w:tcPr>
+            <w:tcW w:w="2875" w:type="dxa"/>
+          </w:tcPr>
+          <w:p>
+            <w:r>
+              <w:t>Documentation</w:t>
+            </w:r>
+          </w:p>
+        </w:tc>
+        <w:tc>
+          <w:tcPr>
+            <w:tcW w:w="1799" w:type="dxa"/>
+          </w:tcPr>
+          <w:p>
+            <w:r>
+              <w:t>Pass</w:t>
+            </w:r>
+          </w:p>
+        </w:tc>
+        <w:tc>
+          <w:tcPr>
+            <w:tcW w:w="2338" w:type="dxa"/>
+          </w:tcPr>
+          <w:p>
+            <w:hyperlink r:id="rId12" w:history="1">
+              <w:r>
+                <w:rPr>
+                  <w:rStyle w:val="Hyperlink"/>
+                </w:rPr>
+                <w:t>Link</w:t>
+              </w:r>
+            </w:hyperlink>
+          </w:p>
+        </w:tc>
+        <w:tc>
+          <w:tcPr>
+            <w:tcW w:w="2338" w:type="dxa"/>
+          </w:tcPr>
+          <w:p>
+            <w:r>
+              <w:t xml:space="preserve">The public </w:t>
+            </w:r>
+            <w:proofErr w:type="spellStart"/>
+            <w:r>
+              <w:t>CacheView</w:t>
+            </w:r>
+            <w:proofErr w:type="spellEnd"/>
+            <w:r>
+              <w:t xml:space="preserve"> documentation is sufficient for this scenario. It explicitly says </w:t>
+            </w:r>
+            <w:proofErr w:type="spellStart"/>
+            <w:r>
+              <w:t>antiforgery</w:t>
+            </w:r>
+            <w:proofErr w:type="spellEnd"/>
+            <w:r>
+              <w:t xml:space="preserve"> tokens and interactive render-mode boundaries render fresh on every request while surrounding content remains cached.</w:t>
+            </w:r>
+          </w:p>
+          <w:p>
+            <w:r>
+              <w:drawing>
+                <wp:inline distT="0" distB="0" distL="0" distR="0" wp14:anchorId="6FB2ED43" wp14:editId="55103467">
+                  <wp:extent cx="2675791" cy="271581"/>
+                  <wp:effectExtent l="0" t="0" r="0" b="0"/>
+                  <wp:docPr id="642672153" name="Picture 1"/>
+                  <wp:cNvGraphicFramePr>
+                    <a:graphicFrameLocks xmlns:a="http://schemas.openxmlformats.org/drawingml/2006/main" noChangeAspect="1"/>
+                  </wp:cNvGraphicFramePr>
+                  <a:graphic xmlns:a="http://schemas.openxmlformats.org/drawingml/2006/main">
+                    <a:graphicData uri="http://schemas.openxmlformats.org/drawingml/2006/picture">
+                      <pic:pic xmlns:pic="http://schemas.openxmlformats.org/drawingml/2006/picture">
+                        <pic:nvPicPr>
+                          <pic:cNvPr id="642672153" name=""/>
+                          <pic:cNvPicPr/>
+                        </pic:nvPicPr>
+                        <pic:blipFill>
+                          <a:blip r:embed="rId13"/>
+                          <a:stretch>
+                            <a:fillRect/>
+                          </a:stretch>
+                        </pic:blipFill>
+                        <pic:spPr>
+                          <a:xfrm>
+                            <a:off x="0" y="0"/>
+                            <a:ext cx="3020754" cy="306593"/>
+                          </a:xfrm>
+                          <a:prstGeom prst="rect">
+                            <a:avLst/>
+                          </a:prstGeom>
+                        </pic:spPr>
+                      </pic:pic>
+                    </a:graphicData>
+                  </a:graphic>
+                </wp:inline>
+              </w:drawing>
+            </w:r>
+          </w:p>
+          <w:p/>
         </w:tc>
       </w:tr>
     </w:tbl>

</xml_diff>

<commit_message>
update the test reports
</commit_message>
<xml_diff>
--- a/Evidence/Test Report for CacheView with Form.docx
+++ b/Evidence/Test Report for CacheView with Form.docx
@@ -171,7 +171,40 @@
         <w:t xml:space="preserve"> </w:t>
       </w:r>
       <w:r>
-        <w:t>macOS, Chrome &amp; Safari</w:t>
+        <w:t>macOS</w:t>
+      </w:r>
+      <w:r>
+        <w:t xml:space="preserve"> ARM64 (</w:t>
+      </w:r>
+      <w:r>
+        <w:t>26.6.2</w:t>
+      </w:r>
+      <w:r>
+        <w:t>)</w:t>
+      </w:r>
+      <w:r>
+        <w:t>, Chrome</w:t>
+      </w:r>
+      <w:r>
+        <w:t xml:space="preserve"> (</w:t>
+      </w:r>
+      <w:r>
+        <w:t>152.0.7977.83</w:t>
+      </w:r>
+      <w:r>
+        <w:t>)</w:t>
+      </w:r>
+      <w:r>
+        <w:t xml:space="preserve"> &amp; Safari</w:t>
+      </w:r>
+      <w:r>
+        <w:t xml:space="preserve"> (</w:t>
+      </w:r>
+      <w:r>
+        <w:t>26.6.2</w:t>
+      </w:r>
+      <w:r>
+        <w:t>)</w:t>
       </w:r>
     </w:p>
     <w:p>
@@ -194,7 +227,19 @@
           <w:rPr>
             <w:rStyle w:val="Hyperlink"/>
           </w:rPr>
-          <w:t>https://github.com/Yuvan111/CacheViewFormComponent</w:t>
+          <w:t>https://gith</w:t>
+        </w:r>
+        <w:r>
+          <w:rPr>
+            <w:rStyle w:val="Hyperlink"/>
+          </w:rPr>
+          <w:t>u</w:t>
+        </w:r>
+        <w:r>
+          <w:rPr>
+            <w:rStyle w:val="Hyperlink"/>
+          </w:rPr>
+          <w:t>b.com/Yuvan111/CacheViewFormComponent</w:t>
         </w:r>
       </w:hyperlink>
       <w:r>
@@ -215,6 +260,9 @@
       </w:r>
       <w:r>
         <w:t xml:space="preserve"> Works</w:t>
+      </w:r>
+      <w:r>
+        <w:t xml:space="preserve"> with some observations.</w:t>
       </w:r>
     </w:p>
     <w:p/>
@@ -388,157 +436,46 @@
             <w:tcW w:w="2338" w:type="dxa"/>
           </w:tcPr>
           <w:p>
-            <w:r>
-              <w:t>-</w:t>
-            </w:r>
-          </w:p>
-        </w:tc>
-      </w:tr>
-      <w:tr>
-        <w:tc>
-          <w:tcPr>
-            <w:tcW w:w="2875" w:type="dxa"/>
-          </w:tcPr>
-          <w:p>
-            <w:r>
-              <w:t>Submitting the form on a warm page succeeds and the submitted value is accepted.</w:t>
-            </w:r>
-          </w:p>
-        </w:tc>
-        <w:tc>
-          <w:tcPr>
-            <w:tcW w:w="1799" w:type="dxa"/>
-          </w:tcPr>
-          <w:p>
-            <w:r>
-              <w:t>Pass</w:t>
-            </w:r>
-          </w:p>
-        </w:tc>
-        <w:tc>
-          <w:tcPr>
-            <w:tcW w:w="2338" w:type="dxa"/>
-          </w:tcPr>
-          <w:p>
             <w:hyperlink r:id="rId7" w:history="1">
               <w:r>
                 <w:rPr>
                   <w:rStyle w:val="Hyperlink"/>
                 </w:rPr>
-                <w:t>Link</w:t>
+                <w:t>Warm Cache Reuse</w:t>
               </w:r>
             </w:hyperlink>
           </w:p>
-        </w:tc>
-        <w:tc>
-          <w:tcPr>
-            <w:tcW w:w="2338" w:type="dxa"/>
-          </w:tcPr>
-          <w:p>
-            <w:r>
-              <w:t>-</w:t>
-            </w:r>
-          </w:p>
-        </w:tc>
-      </w:tr>
-      <w:tr>
-        <w:tc>
-          <w:tcPr>
-            <w:tcW w:w="2875" w:type="dxa"/>
-          </w:tcPr>
-          <w:p>
-            <w:r>
-              <w:t>Submitting with the required field empty shows the field's validation message rather than an error page.</w:t>
-            </w:r>
-          </w:p>
-        </w:tc>
-        <w:tc>
-          <w:tcPr>
-            <w:tcW w:w="1799" w:type="dxa"/>
-          </w:tcPr>
-          <w:p>
-            <w:r>
-              <w:t>Pass</w:t>
-            </w:r>
-          </w:p>
-        </w:tc>
-        <w:tc>
-          <w:tcPr>
-            <w:tcW w:w="2338" w:type="dxa"/>
-          </w:tcPr>
+          <w:p/>
           <w:p>
             <w:hyperlink r:id="rId8" w:history="1">
+              <w:proofErr w:type="spellStart"/>
               <w:r>
                 <w:rPr>
                   <w:rStyle w:val="Hyperlink"/>
                 </w:rPr>
-                <w:t>Link</w:t>
+                <w:t>Antiforgery</w:t>
+              </w:r>
+              <w:proofErr w:type="spellEnd"/>
+              <w:r>
+                <w:rPr>
+                  <w:rStyle w:val="Hyperlink"/>
+                </w:rPr>
+                <w:t xml:space="preserve"> Token</w:t>
               </w:r>
             </w:hyperlink>
           </w:p>
-        </w:tc>
-        <w:tc>
-          <w:tcPr>
-            <w:tcW w:w="2338" w:type="dxa"/>
-          </w:tcPr>
-          <w:p>
-            <w:r>
-              <w:t>-</w:t>
-            </w:r>
-          </w:p>
-        </w:tc>
-      </w:tr>
-      <w:tr>
-        <w:tc>
-          <w:tcPr>
-            <w:tcW w:w="2875" w:type="dxa"/>
-          </w:tcPr>
-          <w:p>
-            <w:r>
-              <w:t xml:space="preserve">Both interactive components respond to a click on a warm load, </w:t>
-            </w:r>
-            <w:r>
-              <w:lastRenderedPageBreak/>
-              <w:t>incrementing their counters.</w:t>
-            </w:r>
-          </w:p>
-        </w:tc>
-        <w:tc>
-          <w:tcPr>
-            <w:tcW w:w="1799" w:type="dxa"/>
-          </w:tcPr>
-          <w:p>
-            <w:r>
-              <w:lastRenderedPageBreak/>
-              <w:t>Pass</w:t>
-            </w:r>
-          </w:p>
-        </w:tc>
-        <w:tc>
-          <w:tcPr>
-            <w:tcW w:w="2338" w:type="dxa"/>
-          </w:tcPr>
+          <w:p/>
           <w:p>
             <w:hyperlink r:id="rId9" w:history="1">
               <w:r>
                 <w:rPr>
                   <w:rStyle w:val="Hyperlink"/>
                 </w:rPr>
-                <w:t>Link</w:t>
+                <w:t>Repeated reload</w:t>
               </w:r>
             </w:hyperlink>
           </w:p>
         </w:tc>
-        <w:tc>
-          <w:tcPr>
-            <w:tcW w:w="2338" w:type="dxa"/>
-          </w:tcPr>
-          <w:p>
-            <w:r>
-              <w:t>-</w:t>
-            </w:r>
-          </w:p>
-        </w:tc>
       </w:tr>
       <w:tr>
         <w:tc>
@@ -547,15 +484,7 @@
           </w:tcPr>
           <w:p>
             <w:r>
-              <w:t xml:space="preserve">With prerendering enabled, the interactive children receive new prerender identifiers on a warm GET even though the surrounding cached child's </w:t>
-            </w:r>
-            <w:proofErr w:type="spellStart"/>
-            <w:r>
-              <w:t>Guid</w:t>
-            </w:r>
-            <w:proofErr w:type="spellEnd"/>
-            <w:r>
-              <w:t xml:space="preserve"> is unchanged.</w:t>
+              <w:t>Submitting the form on a warm page succeeds and the submitted value is accepted.</w:t>
             </w:r>
           </w:p>
         </w:tc>
@@ -589,58 +518,16 @@
             <w:tcW w:w="2338" w:type="dxa"/>
           </w:tcPr>
           <w:p>
-            <w:r>
-              <w:t>-</w:t>
-            </w:r>
-          </w:p>
-        </w:tc>
-      </w:tr>
-      <w:tr>
-        <w:tc>
-          <w:tcPr>
-            <w:tcW w:w="2875" w:type="dxa"/>
-          </w:tcPr>
-          <w:p>
-            <w:r>
-              <w:t>Submissions and clicks still work after the entry has expired and been recreated, and after reloading a warm page several times.</w:t>
-            </w:r>
-          </w:p>
-        </w:tc>
-        <w:tc>
-          <w:tcPr>
-            <w:tcW w:w="1799" w:type="dxa"/>
-          </w:tcPr>
-          <w:p>
-            <w:r>
-              <w:t>Pass</w:t>
-            </w:r>
-          </w:p>
-        </w:tc>
-        <w:tc>
-          <w:tcPr>
-            <w:tcW w:w="2338" w:type="dxa"/>
-          </w:tcPr>
-          <w:p>
             <w:hyperlink r:id="rId11" w:history="1">
               <w:r>
                 <w:rPr>
                   <w:rStyle w:val="Hyperlink"/>
                 </w:rPr>
-                <w:t>Link</w:t>
+                <w:t>Valid Form Submission</w:t>
               </w:r>
             </w:hyperlink>
           </w:p>
         </w:tc>
-        <w:tc>
-          <w:tcPr>
-            <w:tcW w:w="2338" w:type="dxa"/>
-          </w:tcPr>
-          <w:p>
-            <w:r>
-              <w:t>-</w:t>
-            </w:r>
-          </w:p>
-        </w:tc>
       </w:tr>
       <w:tr>
         <w:tc>
@@ -649,7 +536,7 @@
           </w:tcPr>
           <w:p>
             <w:r>
-              <w:t>Documentation</w:t>
+              <w:t>Submitting with the required field empty shows the field's validation message rather than an error page.</w:t>
             </w:r>
           </w:p>
         </w:tc>
@@ -683,6 +570,269 @@
             <w:tcW w:w="2338" w:type="dxa"/>
           </w:tcPr>
           <w:p>
+            <w:hyperlink r:id="rId13" w:history="1">
+              <w:r>
+                <w:rPr>
+                  <w:rStyle w:val="Hyperlink"/>
+                </w:rPr>
+                <w:t>Empty Required Field Validation</w:t>
+              </w:r>
+            </w:hyperlink>
+          </w:p>
+        </w:tc>
+      </w:tr>
+      <w:tr>
+        <w:tc>
+          <w:tcPr>
+            <w:tcW w:w="2875" w:type="dxa"/>
+          </w:tcPr>
+          <w:p>
+            <w:r>
+              <w:t xml:space="preserve">Both interactive components respond to a click on a warm load, </w:t>
+            </w:r>
+            <w:r>
+              <w:lastRenderedPageBreak/>
+              <w:t>incrementing their counters.</w:t>
+            </w:r>
+          </w:p>
+        </w:tc>
+        <w:tc>
+          <w:tcPr>
+            <w:tcW w:w="1799" w:type="dxa"/>
+          </w:tcPr>
+          <w:p>
+            <w:r>
+              <w:lastRenderedPageBreak/>
+              <w:t>Pass</w:t>
+            </w:r>
+          </w:p>
+        </w:tc>
+        <w:tc>
+          <w:tcPr>
+            <w:tcW w:w="2338" w:type="dxa"/>
+          </w:tcPr>
+          <w:p>
+            <w:hyperlink r:id="rId14" w:history="1">
+              <w:r>
+                <w:rPr>
+                  <w:rStyle w:val="Hyperlink"/>
+                </w:rPr>
+                <w:t>Link</w:t>
+              </w:r>
+            </w:hyperlink>
+          </w:p>
+        </w:tc>
+        <w:tc>
+          <w:tcPr>
+            <w:tcW w:w="2338" w:type="dxa"/>
+          </w:tcPr>
+          <w:p>
+            <w:hyperlink r:id="rId15" w:history="1">
+              <w:r>
+                <w:rPr>
+                  <w:rStyle w:val="Hyperlink"/>
+                </w:rPr>
+                <w:t>Interactive Counter Validation</w:t>
+              </w:r>
+            </w:hyperlink>
+          </w:p>
+        </w:tc>
+      </w:tr>
+      <w:tr>
+        <w:tc>
+          <w:tcPr>
+            <w:tcW w:w="2875" w:type="dxa"/>
+          </w:tcPr>
+          <w:p>
+            <w:r>
+              <w:t xml:space="preserve">With prerendering enabled, the interactive children receive new prerender identifiers on a warm GET even though the surrounding cached child's </w:t>
+            </w:r>
+            <w:proofErr w:type="spellStart"/>
+            <w:r>
+              <w:t>Guid</w:t>
+            </w:r>
+            <w:proofErr w:type="spellEnd"/>
+            <w:r>
+              <w:t xml:space="preserve"> is unchanged.</w:t>
+            </w:r>
+          </w:p>
+        </w:tc>
+        <w:tc>
+          <w:tcPr>
+            <w:tcW w:w="1799" w:type="dxa"/>
+          </w:tcPr>
+          <w:p>
+            <w:r>
+              <w:t>Pass</w:t>
+            </w:r>
+          </w:p>
+        </w:tc>
+        <w:tc>
+          <w:tcPr>
+            <w:tcW w:w="2338" w:type="dxa"/>
+          </w:tcPr>
+          <w:p>
+            <w:hyperlink r:id="rId16" w:history="1">
+              <w:r>
+                <w:rPr>
+                  <w:rStyle w:val="Hyperlink"/>
+                </w:rPr>
+                <w:t>Link</w:t>
+              </w:r>
+            </w:hyperlink>
+          </w:p>
+        </w:tc>
+        <w:tc>
+          <w:tcPr>
+            <w:tcW w:w="2338" w:type="dxa"/>
+          </w:tcPr>
+          <w:p>
+            <w:pPr>
+              <w:rPr>
+                <w:rFonts w:ascii="Calibri" w:hAnsi="Calibri" w:cs="Calibri"/>
+              </w:rPr>
+            </w:pPr>
+            <w:hyperlink r:id="rId17" w:history="1">
+              <w:r>
+                <w:rPr>
+                  <w:rStyle w:val="Hyperlink"/>
+                  <w:rFonts w:ascii="Calibri" w:hAnsi="Calibri" w:cs="Calibri"/>
+                  <w:shd w:val="clear" w:color="auto" w:fill="FFFFFF"/>
+                </w:rPr>
+                <w:t>Interactive Marker</w:t>
+              </w:r>
+            </w:hyperlink>
+          </w:p>
+        </w:tc>
+      </w:tr>
+      <w:tr>
+        <w:tc>
+          <w:tcPr>
+            <w:tcW w:w="2875" w:type="dxa"/>
+          </w:tcPr>
+          <w:p>
+            <w:r>
+              <w:t>Submissions and clicks still work after the entry has expired and been recreated, and after reloading a warm page several times.</w:t>
+            </w:r>
+          </w:p>
+        </w:tc>
+        <w:tc>
+          <w:tcPr>
+            <w:tcW w:w="1799" w:type="dxa"/>
+          </w:tcPr>
+          <w:p>
+            <w:r>
+              <w:t>Pass</w:t>
+            </w:r>
+          </w:p>
+        </w:tc>
+        <w:tc>
+          <w:tcPr>
+            <w:tcW w:w="2338" w:type="dxa"/>
+          </w:tcPr>
+          <w:p>
+            <w:hyperlink r:id="rId18" w:history="1">
+              <w:r>
+                <w:rPr>
+                  <w:rStyle w:val="Hyperlink"/>
+                </w:rPr>
+                <w:t>Link</w:t>
+              </w:r>
+            </w:hyperlink>
+          </w:p>
+        </w:tc>
+        <w:tc>
+          <w:tcPr>
+            <w:tcW w:w="2338" w:type="dxa"/>
+          </w:tcPr>
+          <w:p>
+            <w:hyperlink r:id="rId19" w:history="1">
+              <w:r>
+                <w:rPr>
+                  <w:rStyle w:val="Hyperlink"/>
+                </w:rPr>
+                <w:t>Cache Expirat</w:t>
+              </w:r>
+              <w:r>
+                <w:rPr>
+                  <w:rStyle w:val="Hyperlink"/>
+                </w:rPr>
+                <w:t>i</w:t>
+              </w:r>
+              <w:r>
+                <w:rPr>
+                  <w:rStyle w:val="Hyperlink"/>
+                </w:rPr>
+                <w:t>on and Re</w:t>
+              </w:r>
+              <w:r>
+                <w:rPr>
+                  <w:rStyle w:val="Hyperlink"/>
+                </w:rPr>
+                <w:t>c</w:t>
+              </w:r>
+              <w:r>
+                <w:rPr>
+                  <w:rStyle w:val="Hyperlink"/>
+                </w:rPr>
+                <w:t>reation</w:t>
+              </w:r>
+            </w:hyperlink>
+          </w:p>
+          <w:p/>
+          <w:p>
+            <w:hyperlink r:id="rId20" w:history="1">
+              <w:r>
+                <w:rPr>
+                  <w:rStyle w:val="Hyperlink"/>
+                </w:rPr>
+                <w:t>Post-expiry results</w:t>
+              </w:r>
+            </w:hyperlink>
+          </w:p>
+        </w:tc>
+      </w:tr>
+      <w:tr>
+        <w:tc>
+          <w:tcPr>
+            <w:tcW w:w="2875" w:type="dxa"/>
+          </w:tcPr>
+          <w:p>
+            <w:r>
+              <w:t>Documentation</w:t>
+            </w:r>
+          </w:p>
+        </w:tc>
+        <w:tc>
+          <w:tcPr>
+            <w:tcW w:w="1799" w:type="dxa"/>
+          </w:tcPr>
+          <w:p>
+            <w:r>
+              <w:t>Pass</w:t>
+            </w:r>
+          </w:p>
+        </w:tc>
+        <w:tc>
+          <w:tcPr>
+            <w:tcW w:w="2338" w:type="dxa"/>
+          </w:tcPr>
+          <w:p>
+            <w:hyperlink r:id="rId21" w:history="1">
+              <w:r>
+                <w:rPr>
+                  <w:rStyle w:val="Hyperlink"/>
+                </w:rPr>
+                <w:t>Link</w:t>
+              </w:r>
+            </w:hyperlink>
+          </w:p>
+        </w:tc>
+        <w:tc>
+          <w:tcPr>
+            <w:tcW w:w="2338" w:type="dxa"/>
+          </w:tcPr>
+          <w:p>
             <w:r>
               <w:t xml:space="preserve">The public </w:t>
             </w:r>
@@ -705,6 +855,9 @@
           </w:p>
           <w:p>
             <w:r>
+              <w:rPr>
+                <w:noProof/>
+              </w:rPr>
               <w:drawing>
                 <wp:inline distT="0" distB="0" distL="0" distR="0" wp14:anchorId="6FB2ED43" wp14:editId="55103467">
                   <wp:extent cx="2675791" cy="271581"/>
@@ -721,7 +874,7 @@
                           <pic:cNvPicPr/>
                         </pic:nvPicPr>
                         <pic:blipFill>
-                          <a:blip r:embed="rId13"/>
+                          <a:blip r:embed="rId22"/>
                           <a:stretch>
                             <a:fillRect/>
                           </a:stretch>
@@ -746,6 +899,184 @@
         </w:tc>
       </w:tr>
     </w:tbl>
+    <w:p/>
+    <w:p>
+      <w:pPr>
+        <w:rPr>
+          <w:b/>
+          <w:bCs/>
+        </w:rPr>
+      </w:pPr>
+      <w:r>
+        <w:rPr>
+          <w:b/>
+          <w:bCs/>
+        </w:rPr>
+        <w:t>Observation</w:t>
+      </w:r>
+      <w:r>
+        <w:rPr>
+          <w:b/>
+          <w:bCs/>
+        </w:rPr>
+        <w:t xml:space="preserve"> (Need to confirm the behavior)</w:t>
+      </w:r>
+      <w:r>
+        <w:rPr>
+          <w:b/>
+          <w:bCs/>
+        </w:rPr>
+        <w:t>:</w:t>
+      </w:r>
+    </w:p>
+    <w:p/>
+    <w:p>
+      <w:r>
+        <w:t xml:space="preserve">1. </w:t>
+      </w:r>
+      <w:r>
+        <w:rPr>
+          <w:rStyle w:val="Strong"/>
+          <w:rFonts w:ascii="Segoe UI" w:hAnsi="Segoe UI" w:cs="Segoe UI"/>
+          <w:color w:val="1F2328"/>
+          <w:sz w:val="21"/>
+          <w:szCs w:val="21"/>
+        </w:rPr>
+        <w:t>Scenario problem</w:t>
+      </w:r>
+      <w:r>
+        <w:t xml:space="preserve">: </w:t>
+      </w:r>
+      <w:proofErr w:type="spellStart"/>
+      <w:r>
+        <w:t>Guid</w:t>
+      </w:r>
+      <w:proofErr w:type="spellEnd"/>
+      <w:r>
+        <w:t xml:space="preserve"> value within </w:t>
+      </w:r>
+      <w:proofErr w:type="spellStart"/>
+      <w:r>
+        <w:t>CacheView</w:t>
+      </w:r>
+      <w:proofErr w:type="spellEnd"/>
+      <w:r>
+        <w:t xml:space="preserve"> component have changed after form submit and followed by after every refresh page.</w:t>
+      </w:r>
+    </w:p>
+    <w:p>
+      <w:r>
+        <w:t xml:space="preserve">   - What happened</w:t>
+      </w:r>
+      <w:r>
+        <w:t>: When submit the form with valid value, then GUID value change and after that every page refresh GUID value change.</w:t>
+      </w:r>
+    </w:p>
+    <w:p>
+      <w:r>
+        <w:t xml:space="preserve">   - W</w:t>
+      </w:r>
+      <w:r>
+        <w:t>hat you expected instead</w:t>
+      </w:r>
+      <w:r>
+        <w:t>: GUID value must be same for form submit and page refresh before expires time.</w:t>
+      </w:r>
+    </w:p>
+    <w:p>
+      <w:r>
+        <w:lastRenderedPageBreak/>
+        <w:t xml:space="preserve">   - S</w:t>
+      </w:r>
+      <w:r>
+        <w:t>teps to reproduce</w:t>
+      </w:r>
+      <w:r>
+        <w:t>:</w:t>
+      </w:r>
+    </w:p>
+    <w:p>
+      <w:pPr>
+        <w:pStyle w:val="ListParagraph"/>
+        <w:numPr>
+          <w:ilvl w:val="0"/>
+          <w:numId w:val="2"/>
+        </w:numPr>
+      </w:pPr>
+      <w:r>
+        <w:t>Refresh the page.</w:t>
+      </w:r>
+    </w:p>
+    <w:p>
+      <w:pPr>
+        <w:pStyle w:val="ListParagraph"/>
+        <w:numPr>
+          <w:ilvl w:val="0"/>
+          <w:numId w:val="2"/>
+        </w:numPr>
+      </w:pPr>
+      <w:r>
+        <w:t>Enter the any valid value in input.</w:t>
+      </w:r>
+    </w:p>
+    <w:p>
+      <w:pPr>
+        <w:pStyle w:val="ListParagraph"/>
+        <w:numPr>
+          <w:ilvl w:val="0"/>
+          <w:numId w:val="2"/>
+        </w:numPr>
+      </w:pPr>
+      <w:r>
+        <w:t>Submit the form.</w:t>
+      </w:r>
+    </w:p>
+    <w:p>
+      <w:pPr>
+        <w:pStyle w:val="ListParagraph"/>
+        <w:numPr>
+          <w:ilvl w:val="0"/>
+          <w:numId w:val="2"/>
+        </w:numPr>
+      </w:pPr>
+      <w:r>
+        <w:t>You can see the GUID value has changed.</w:t>
+      </w:r>
+    </w:p>
+    <w:p>
+      <w:pPr>
+        <w:pStyle w:val="ListParagraph"/>
+        <w:numPr>
+          <w:ilvl w:val="0"/>
+          <w:numId w:val="2"/>
+        </w:numPr>
+      </w:pPr>
+      <w:r>
+        <w:t>And refresh the page and every refresh action the GUID value will changed.</w:t>
+      </w:r>
+    </w:p>
+    <w:p>
+      <w:pPr>
+        <w:jc w:val="both"/>
+      </w:pPr>
+      <w:r>
+        <w:t xml:space="preserve">   - Evidence: </w:t>
+      </w:r>
+      <w:hyperlink r:id="rId23" w:history="1">
+        <w:r>
+          <w:rPr>
+            <w:rStyle w:val="Hyperlink"/>
+          </w:rPr>
+          <w:t>L</w:t>
+        </w:r>
+        <w:r>
+          <w:rPr>
+            <w:rStyle w:val="Hyperlink"/>
+          </w:rPr>
+          <w:t>ink</w:t>
+        </w:r>
+      </w:hyperlink>
+    </w:p>
     <w:p/>
     <w:sectPr>
       <w:pgSz w:w="12240" w:h="15840"/>
@@ -908,8 +1239,97 @@
       </w:rPr>
     </w:lvl>
   </w:abstractNum>
+  <w:abstractNum w:abstractNumId="1" w15:restartNumberingAfterBreak="0">
+    <w:nsid w:val="4D4D5273"/>
+    <w:multiLevelType w:val="hybridMultilevel"/>
+    <w:tmpl w:val="89A287CE"/>
+    <w:lvl w:ilvl="0" w:tplc="0409000F">
+      <w:start w:val="1"/>
+      <w:numFmt w:val="decimal"/>
+      <w:lvlText w:val="%1."/>
+      <w:lvlJc w:val="left"/>
+      <w:pPr>
+        <w:ind w:left="720" w:hanging="360"/>
+      </w:pPr>
+    </w:lvl>
+    <w:lvl w:ilvl="1" w:tplc="04090019" w:tentative="1">
+      <w:start w:val="1"/>
+      <w:numFmt w:val="lowerLetter"/>
+      <w:lvlText w:val="%2."/>
+      <w:lvlJc w:val="left"/>
+      <w:pPr>
+        <w:ind w:left="1440" w:hanging="360"/>
+      </w:pPr>
+    </w:lvl>
+    <w:lvl w:ilvl="2" w:tplc="0409001B" w:tentative="1">
+      <w:start w:val="1"/>
+      <w:numFmt w:val="lowerRoman"/>
+      <w:lvlText w:val="%3."/>
+      <w:lvlJc w:val="right"/>
+      <w:pPr>
+        <w:ind w:left="2160" w:hanging="180"/>
+      </w:pPr>
+    </w:lvl>
+    <w:lvl w:ilvl="3" w:tplc="0409000F" w:tentative="1">
+      <w:start w:val="1"/>
+      <w:numFmt w:val="decimal"/>
+      <w:lvlText w:val="%4."/>
+      <w:lvlJc w:val="left"/>
+      <w:pPr>
+        <w:ind w:left="2880" w:hanging="360"/>
+      </w:pPr>
+    </w:lvl>
+    <w:lvl w:ilvl="4" w:tplc="04090019" w:tentative="1">
+      <w:start w:val="1"/>
+      <w:numFmt w:val="lowerLetter"/>
+      <w:lvlText w:val="%5."/>
+      <w:lvlJc w:val="left"/>
+      <w:pPr>
+        <w:ind w:left="3600" w:hanging="360"/>
+      </w:pPr>
+    </w:lvl>
+    <w:lvl w:ilvl="5" w:tplc="0409001B" w:tentative="1">
+      <w:start w:val="1"/>
+      <w:numFmt w:val="lowerRoman"/>
+      <w:lvlText w:val="%6."/>
+      <w:lvlJc w:val="right"/>
+      <w:pPr>
+        <w:ind w:left="4320" w:hanging="180"/>
+      </w:pPr>
+    </w:lvl>
+    <w:lvl w:ilvl="6" w:tplc="0409000F" w:tentative="1">
+      <w:start w:val="1"/>
+      <w:numFmt w:val="decimal"/>
+      <w:lvlText w:val="%7."/>
+      <w:lvlJc w:val="left"/>
+      <w:pPr>
+        <w:ind w:left="5040" w:hanging="360"/>
+      </w:pPr>
+    </w:lvl>
+    <w:lvl w:ilvl="7" w:tplc="04090019" w:tentative="1">
+      <w:start w:val="1"/>
+      <w:numFmt w:val="lowerLetter"/>
+      <w:lvlText w:val="%8."/>
+      <w:lvlJc w:val="left"/>
+      <w:pPr>
+        <w:ind w:left="5760" w:hanging="360"/>
+      </w:pPr>
+    </w:lvl>
+    <w:lvl w:ilvl="8" w:tplc="0409001B" w:tentative="1">
+      <w:start w:val="1"/>
+      <w:numFmt w:val="lowerRoman"/>
+      <w:lvlText w:val="%9."/>
+      <w:lvlJc w:val="right"/>
+      <w:pPr>
+        <w:ind w:left="6480" w:hanging="180"/>
+      </w:pPr>
+    </w:lvl>
+  </w:abstractNum>
   <w:num w:numId="1" w16cid:durableId="1289164866">
     <w:abstractNumId w:val="0"/>
+  </w:num>
+  <w:num w:numId="2" w16cid:durableId="1114398384">
+    <w:abstractNumId w:val="1"/>
   </w:num>
 </w:numbering>
 </file>
@@ -1874,6 +2294,29 @@
       <w:shd w:val="clear" w:color="auto" w:fill="E1DFDD"/>
     </w:rPr>
   </w:style>
+  <w:style w:type="character" w:styleId="FollowedHyperlink">
+    <w:name w:val="FollowedHyperlink"/>
+    <w:basedOn w:val="DefaultParagraphFont"/>
+    <w:uiPriority w:val="99"/>
+    <w:semiHidden/>
+    <w:unhideWhenUsed/>
+    <w:rsid w:val="00624A93"/>
+    <w:rPr>
+      <w:color w:val="96607D" w:themeColor="followedHyperlink"/>
+      <w:u w:val="single"/>
+    </w:rPr>
+  </w:style>
+  <w:style w:type="character" w:styleId="Strong">
+    <w:name w:val="Strong"/>
+    <w:basedOn w:val="DefaultParagraphFont"/>
+    <w:uiPriority w:val="22"/>
+    <w:qFormat/>
+    <w:rsid w:val="00AF540E"/>
+    <w:rPr>
+      <w:b/>
+      <w:bCs/>
+    </w:rPr>
+  </w:style>
 </w:styles>
 </file>
 

</xml_diff>

<commit_message>
Update the test report with problem details
</commit_message>
<xml_diff>
--- a/Evidence/Test Report for CacheView with Form.docx
+++ b/Evidence/Test Report for CacheView with Form.docx
@@ -227,19 +227,7 @@
           <w:rPr>
             <w:rStyle w:val="Hyperlink"/>
           </w:rPr>
-          <w:t>https://gith</w:t>
-        </w:r>
-        <w:r>
-          <w:rPr>
-            <w:rStyle w:val="Hyperlink"/>
-          </w:rPr>
-          <w:t>u</w:t>
-        </w:r>
-        <w:r>
-          <w:rPr>
-            <w:rStyle w:val="Hyperlink"/>
-          </w:rPr>
-          <w:t>b.com/Yuvan111/CacheViewFormComponent</w:t>
+          <w:t>https://github.com/Yuvan111/CacheViewFormComponent</w:t>
         </w:r>
       </w:hyperlink>
       <w:r>
@@ -262,7 +250,10 @@
         <w:t xml:space="preserve"> Works</w:t>
       </w:r>
       <w:r>
-        <w:t xml:space="preserve"> with some observations.</w:t>
+        <w:t xml:space="preserve"> with </w:t>
+      </w:r>
+      <w:r>
+        <w:t>issue.</w:t>
       </w:r>
     </w:p>
     <w:p/>
@@ -300,7 +291,7 @@
       <w:tr>
         <w:tc>
           <w:tcPr>
-            <w:tcW w:w="2875" w:type="dxa"/>
+            <w:tcW w:w="2162" w:type="dxa"/>
           </w:tcPr>
           <w:p>
             <w:pPr>
@@ -320,7 +311,7 @@
         </w:tc>
         <w:tc>
           <w:tcPr>
-            <w:tcW w:w="1799" w:type="dxa"/>
+            <w:tcW w:w="1192" w:type="dxa"/>
           </w:tcPr>
           <w:p>
             <w:pPr>
@@ -340,7 +331,7 @@
         </w:tc>
         <w:tc>
           <w:tcPr>
-            <w:tcW w:w="2338" w:type="dxa"/>
+            <w:tcW w:w="1567" w:type="dxa"/>
           </w:tcPr>
           <w:p>
             <w:pPr>
@@ -360,7 +351,7 @@
         </w:tc>
         <w:tc>
           <w:tcPr>
-            <w:tcW w:w="2338" w:type="dxa"/>
+            <w:tcW w:w="4429" w:type="dxa"/>
           </w:tcPr>
           <w:p>
             <w:pPr>
@@ -382,7 +373,7 @@
       <w:tr>
         <w:tc>
           <w:tcPr>
-            <w:tcW w:w="2875" w:type="dxa"/>
+            <w:tcW w:w="2162" w:type="dxa"/>
           </w:tcPr>
           <w:p>
             <w:r>
@@ -408,7 +399,7 @@
         </w:tc>
         <w:tc>
           <w:tcPr>
-            <w:tcW w:w="1799" w:type="dxa"/>
+            <w:tcW w:w="1192" w:type="dxa"/>
           </w:tcPr>
           <w:p>
             <w:r>
@@ -418,7 +409,7 @@
         </w:tc>
         <w:tc>
           <w:tcPr>
-            <w:tcW w:w="2338" w:type="dxa"/>
+            <w:tcW w:w="1567" w:type="dxa"/>
           </w:tcPr>
           <w:p>
             <w:hyperlink r:id="rId6" w:history="1">
@@ -433,7 +424,7 @@
         </w:tc>
         <w:tc>
           <w:tcPr>
-            <w:tcW w:w="2338" w:type="dxa"/>
+            <w:tcW w:w="4429" w:type="dxa"/>
           </w:tcPr>
           <w:p>
             <w:hyperlink r:id="rId7" w:history="1">
@@ -480,7 +471,7 @@
       <w:tr>
         <w:tc>
           <w:tcPr>
-            <w:tcW w:w="2875" w:type="dxa"/>
+            <w:tcW w:w="2162" w:type="dxa"/>
           </w:tcPr>
           <w:p>
             <w:r>
@@ -490,9 +481,12 @@
         </w:tc>
         <w:tc>
           <w:tcPr>
-            <w:tcW w:w="1799" w:type="dxa"/>
-          </w:tcPr>
-          <w:p>
+            <w:tcW w:w="1192" w:type="dxa"/>
+          </w:tcPr>
+          <w:p>
+            <w:r>
+              <w:t xml:space="preserve">Partial </w:t>
+            </w:r>
             <w:r>
               <w:t>Pass</w:t>
             </w:r>
@@ -500,7 +494,7 @@
         </w:tc>
         <w:tc>
           <w:tcPr>
-            <w:tcW w:w="2338" w:type="dxa"/>
+            <w:tcW w:w="1567" w:type="dxa"/>
           </w:tcPr>
           <w:p>
             <w:hyperlink r:id="rId10" w:history="1">
@@ -515,7 +509,7 @@
         </w:tc>
         <w:tc>
           <w:tcPr>
-            <w:tcW w:w="2338" w:type="dxa"/>
+            <w:tcW w:w="4429" w:type="dxa"/>
           </w:tcPr>
           <w:p>
             <w:hyperlink r:id="rId11" w:history="1">
@@ -523,16 +517,40 @@
                 <w:rPr>
                   <w:rStyle w:val="Hyperlink"/>
                 </w:rPr>
-                <w:t>Valid Form Submission</w:t>
+                <w:t>Valid Form Subm</w:t>
+              </w:r>
+              <w:r>
+                <w:rPr>
+                  <w:rStyle w:val="Hyperlink"/>
+                </w:rPr>
+                <w:t>i</w:t>
+              </w:r>
+              <w:r>
+                <w:rPr>
+                  <w:rStyle w:val="Hyperlink"/>
+                </w:rPr>
+                <w:t>ssio</w:t>
+              </w:r>
+              <w:r>
+                <w:rPr>
+                  <w:rStyle w:val="Hyperlink"/>
+                </w:rPr>
+                <w:t>n</w:t>
               </w:r>
             </w:hyperlink>
           </w:p>
+          <w:p/>
+          <w:p>
+            <w:r>
+              <w:t>GUID value changes after the form submit</w:t>
+            </w:r>
+          </w:p>
         </w:tc>
       </w:tr>
       <w:tr>
         <w:tc>
           <w:tcPr>
-            <w:tcW w:w="2875" w:type="dxa"/>
+            <w:tcW w:w="2162" w:type="dxa"/>
           </w:tcPr>
           <w:p>
             <w:r>
@@ -542,7 +560,7 @@
         </w:tc>
         <w:tc>
           <w:tcPr>
-            <w:tcW w:w="1799" w:type="dxa"/>
+            <w:tcW w:w="1192" w:type="dxa"/>
           </w:tcPr>
           <w:p>
             <w:r>
@@ -552,7 +570,7 @@
         </w:tc>
         <w:tc>
           <w:tcPr>
-            <w:tcW w:w="2338" w:type="dxa"/>
+            <w:tcW w:w="1567" w:type="dxa"/>
           </w:tcPr>
           <w:p>
             <w:hyperlink r:id="rId12" w:history="1">
@@ -567,7 +585,7 @@
         </w:tc>
         <w:tc>
           <w:tcPr>
-            <w:tcW w:w="2338" w:type="dxa"/>
+            <w:tcW w:w="4429" w:type="dxa"/>
           </w:tcPr>
           <w:p>
             <w:hyperlink r:id="rId13" w:history="1">
@@ -584,7 +602,7 @@
       <w:tr>
         <w:tc>
           <w:tcPr>
-            <w:tcW w:w="2875" w:type="dxa"/>
+            <w:tcW w:w="2162" w:type="dxa"/>
           </w:tcPr>
           <w:p>
             <w:r>
@@ -598,7 +616,7 @@
         </w:tc>
         <w:tc>
           <w:tcPr>
-            <w:tcW w:w="1799" w:type="dxa"/>
+            <w:tcW w:w="1192" w:type="dxa"/>
           </w:tcPr>
           <w:p>
             <w:r>
@@ -609,7 +627,7 @@
         </w:tc>
         <w:tc>
           <w:tcPr>
-            <w:tcW w:w="2338" w:type="dxa"/>
+            <w:tcW w:w="1567" w:type="dxa"/>
           </w:tcPr>
           <w:p>
             <w:hyperlink r:id="rId14" w:history="1">
@@ -624,7 +642,7 @@
         </w:tc>
         <w:tc>
           <w:tcPr>
-            <w:tcW w:w="2338" w:type="dxa"/>
+            <w:tcW w:w="4429" w:type="dxa"/>
           </w:tcPr>
           <w:p>
             <w:hyperlink r:id="rId15" w:history="1">
@@ -641,7 +659,7 @@
       <w:tr>
         <w:tc>
           <w:tcPr>
-            <w:tcW w:w="2875" w:type="dxa"/>
+            <w:tcW w:w="2162" w:type="dxa"/>
           </w:tcPr>
           <w:p>
             <w:r>
@@ -659,7 +677,7 @@
         </w:tc>
         <w:tc>
           <w:tcPr>
-            <w:tcW w:w="1799" w:type="dxa"/>
+            <w:tcW w:w="1192" w:type="dxa"/>
           </w:tcPr>
           <w:p>
             <w:r>
@@ -669,7 +687,7 @@
         </w:tc>
         <w:tc>
           <w:tcPr>
-            <w:tcW w:w="2338" w:type="dxa"/>
+            <w:tcW w:w="1567" w:type="dxa"/>
           </w:tcPr>
           <w:p>
             <w:hyperlink r:id="rId16" w:history="1">
@@ -684,7 +702,7 @@
         </w:tc>
         <w:tc>
           <w:tcPr>
-            <w:tcW w:w="2338" w:type="dxa"/>
+            <w:tcW w:w="4429" w:type="dxa"/>
           </w:tcPr>
           <w:p>
             <w:pPr>
@@ -708,7 +726,7 @@
       <w:tr>
         <w:tc>
           <w:tcPr>
-            <w:tcW w:w="2875" w:type="dxa"/>
+            <w:tcW w:w="2162" w:type="dxa"/>
           </w:tcPr>
           <w:p>
             <w:r>
@@ -718,7 +736,7 @@
         </w:tc>
         <w:tc>
           <w:tcPr>
-            <w:tcW w:w="1799" w:type="dxa"/>
+            <w:tcW w:w="1192" w:type="dxa"/>
           </w:tcPr>
           <w:p>
             <w:r>
@@ -728,7 +746,7 @@
         </w:tc>
         <w:tc>
           <w:tcPr>
-            <w:tcW w:w="2338" w:type="dxa"/>
+            <w:tcW w:w="1567" w:type="dxa"/>
           </w:tcPr>
           <w:p>
             <w:hyperlink r:id="rId18" w:history="1">
@@ -743,7 +761,7 @@
         </w:tc>
         <w:tc>
           <w:tcPr>
-            <w:tcW w:w="2338" w:type="dxa"/>
+            <w:tcW w:w="4429" w:type="dxa"/>
           </w:tcPr>
           <w:p>
             <w:hyperlink r:id="rId19" w:history="1">
@@ -751,31 +769,7 @@
                 <w:rPr>
                   <w:rStyle w:val="Hyperlink"/>
                 </w:rPr>
-                <w:t>Cache Expirat</w:t>
-              </w:r>
-              <w:r>
-                <w:rPr>
-                  <w:rStyle w:val="Hyperlink"/>
-                </w:rPr>
-                <w:t>i</w:t>
-              </w:r>
-              <w:r>
-                <w:rPr>
-                  <w:rStyle w:val="Hyperlink"/>
-                </w:rPr>
-                <w:t>on and Re</w:t>
-              </w:r>
-              <w:r>
-                <w:rPr>
-                  <w:rStyle w:val="Hyperlink"/>
-                </w:rPr>
-                <w:t>c</w:t>
-              </w:r>
-              <w:r>
-                <w:rPr>
-                  <w:rStyle w:val="Hyperlink"/>
-                </w:rPr>
-                <w:t>reation</w:t>
+                <w:t>Cache Expiration and Recreation</w:t>
               </w:r>
             </w:hyperlink>
           </w:p>
@@ -795,7 +789,7 @@
       <w:tr>
         <w:tc>
           <w:tcPr>
-            <w:tcW w:w="2875" w:type="dxa"/>
+            <w:tcW w:w="2162" w:type="dxa"/>
           </w:tcPr>
           <w:p>
             <w:r>
@@ -805,7 +799,7 @@
         </w:tc>
         <w:tc>
           <w:tcPr>
-            <w:tcW w:w="1799" w:type="dxa"/>
+            <w:tcW w:w="1192" w:type="dxa"/>
           </w:tcPr>
           <w:p>
             <w:r>
@@ -815,10 +809,10 @@
         </w:tc>
         <w:tc>
           <w:tcPr>
-            <w:tcW w:w="2338" w:type="dxa"/>
-          </w:tcPr>
-          <w:p>
-            <w:hyperlink r:id="rId21" w:history="1">
+            <w:tcW w:w="1567" w:type="dxa"/>
+          </w:tcPr>
+          <w:p>
+            <w:hyperlink r:id="rId21" w:anchor="components-that-render-on-every-request" w:history="1">
               <w:r>
                 <w:rPr>
                   <w:rStyle w:val="Hyperlink"/>
@@ -830,7 +824,7 @@
         </w:tc>
         <w:tc>
           <w:tcPr>
-            <w:tcW w:w="2338" w:type="dxa"/>
+            <w:tcW w:w="4429" w:type="dxa"/>
           </w:tcPr>
           <w:p>
             <w:r>
@@ -898,8 +892,93 @@
           <w:p/>
         </w:tc>
       </w:tr>
+      <w:tr>
+        <w:tc>
+          <w:tcPr>
+            <w:tcW w:w="2162" w:type="dxa"/>
+          </w:tcPr>
+          <w:p>
+            <w:r>
+              <w:t xml:space="preserve">Repeated Warm Reload </w:t>
+            </w:r>
+            <w:r>
+              <w:t>Form</w:t>
+            </w:r>
+            <w:r>
+              <w:t xml:space="preserve"> </w:t>
+            </w:r>
+            <w:r>
+              <w:t>Validation</w:t>
+            </w:r>
+          </w:p>
+        </w:tc>
+        <w:tc>
+          <w:tcPr>
+            <w:tcW w:w="1192" w:type="dxa"/>
+          </w:tcPr>
+          <w:p>
+            <w:r>
+              <w:t>Fail</w:t>
+            </w:r>
+          </w:p>
+        </w:tc>
+        <w:tc>
+          <w:tcPr>
+            <w:tcW w:w="1567" w:type="dxa"/>
+          </w:tcPr>
+          <w:p>
+            <w:hyperlink r:id="rId23" w:history="1">
+              <w:r>
+                <w:rPr>
+                  <w:rStyle w:val="Hyperlink"/>
+                </w:rPr>
+                <w:t>Link</w:t>
+              </w:r>
+            </w:hyperlink>
+          </w:p>
+        </w:tc>
+        <w:tc>
+          <w:tcPr>
+            <w:tcW w:w="4429" w:type="dxa"/>
+          </w:tcPr>
+          <w:p>
+            <w:r>
+              <w:t>When submit the form with valid value, then GUID value change and after that every page refresh GUID value change.</w:t>
+            </w:r>
+          </w:p>
+          <w:p/>
+          <w:p>
+            <w:hyperlink r:id="rId24" w:history="1">
+              <w:r>
+                <w:rPr>
+                  <w:rStyle w:val="Hyperlink"/>
+                </w:rPr>
+                <w:t xml:space="preserve">Repeated warm </w:t>
+              </w:r>
+              <w:proofErr w:type="spellStart"/>
+              <w:r>
+                <w:rPr>
+                  <w:rStyle w:val="Hyperlink"/>
+                </w:rPr>
+                <w:t>relaod</w:t>
+              </w:r>
+              <w:proofErr w:type="spellEnd"/>
+            </w:hyperlink>
+          </w:p>
+          <w:p/>
+          <w:p>
+            <w:hyperlink r:id="rId25" w:history="1">
+              <w:r>
+                <w:rPr>
+                  <w:rStyle w:val="Hyperlink"/>
+                </w:rPr>
+                <w:t>Repeat form submission</w:t>
+              </w:r>
+            </w:hyperlink>
+          </w:p>
+        </w:tc>
+      </w:tr>
     </w:tbl>
-    <w:p/>
     <w:p>
       <w:pPr>
         <w:rPr>
@@ -907,19 +986,20 @@
           <w:bCs/>
         </w:rPr>
       </w:pPr>
-      <w:r>
+    </w:p>
+    <w:p>
+      <w:pPr>
         <w:rPr>
           <w:b/>
           <w:bCs/>
         </w:rPr>
-        <w:t>Observation</w:t>
-      </w:r>
+      </w:pPr>
       <w:r>
         <w:rPr>
           <w:b/>
           <w:bCs/>
         </w:rPr>
-        <w:t xml:space="preserve"> (Need to confirm the behavior)</w:t>
+        <w:t>Problem</w:t>
       </w:r>
       <w:r>
         <w:rPr>
@@ -932,6 +1012,7 @@
     <w:p/>
     <w:p>
       <w:r>
+        <w:lastRenderedPageBreak/>
         <w:t xml:space="preserve">1. </w:t>
       </w:r>
       <w:r>
@@ -942,54 +1023,89 @@
           <w:sz w:val="21"/>
           <w:szCs w:val="21"/>
         </w:rPr>
-        <w:t>Scenario problem</w:t>
+        <w:t xml:space="preserve">Product </w:t>
+      </w:r>
+      <w:r>
+        <w:rPr>
+          <w:rStyle w:val="Strong"/>
+          <w:rFonts w:ascii="Segoe UI" w:hAnsi="Segoe UI" w:cs="Segoe UI"/>
+          <w:color w:val="1F2328"/>
+          <w:sz w:val="21"/>
+          <w:szCs w:val="21"/>
+        </w:rPr>
+        <w:t>B</w:t>
+      </w:r>
+      <w:r>
+        <w:rPr>
+          <w:rStyle w:val="Strong"/>
+          <w:rFonts w:ascii="Segoe UI" w:hAnsi="Segoe UI" w:cs="Segoe UI"/>
+          <w:color w:val="1F2328"/>
+          <w:sz w:val="21"/>
+          <w:szCs w:val="21"/>
+        </w:rPr>
+        <w:t>ug</w:t>
       </w:r>
       <w:r>
         <w:t xml:space="preserve">: </w:t>
       </w:r>
+      <w:r>
+        <w:t xml:space="preserve">GUID value within the </w:t>
+      </w:r>
       <w:proofErr w:type="spellStart"/>
       <w:r>
-        <w:t>Guid</w:t>
+        <w:t>CacheView</w:t>
       </w:r>
       <w:proofErr w:type="spellEnd"/>
       <w:r>
-        <w:t xml:space="preserve"> value within </w:t>
-      </w:r>
-      <w:proofErr w:type="spellStart"/>
-      <w:r>
-        <w:t>CacheView</w:t>
-      </w:r>
-      <w:proofErr w:type="spellEnd"/>
-      <w:r>
-        <w:t xml:space="preserve"> component have changed after form submit and followed by after every refresh page.</w:t>
+        <w:t xml:space="preserve"> component changes after form submission and on every subsequent page refresh.</w:t>
       </w:r>
     </w:p>
     <w:p>
       <w:r>
-        <w:t xml:space="preserve">   - What happened</w:t>
-      </w:r>
-      <w:r>
-        <w:t>: When submit the form with valid value, then GUID value change and after that every page refresh GUID value change.</w:t>
+        <w:t xml:space="preserve">   - </w:t>
+      </w:r>
+      <w:r>
+        <w:rPr>
+          <w:b/>
+          <w:bCs/>
+        </w:rPr>
+        <w:t>What happened</w:t>
+      </w:r>
+      <w:r>
+        <w:t xml:space="preserve">: </w:t>
+      </w:r>
+      <w:r>
+        <w:t>After submitting the form with a valid input value, the displayed GUID changes unexpectedly. Following the form submission, the GUID continues to change on every page refresh.</w:t>
       </w:r>
     </w:p>
     <w:p>
       <w:r>
-        <w:t xml:space="preserve">   - W</w:t>
-      </w:r>
-      <w:r>
-        <w:t>hat you expected instead</w:t>
-      </w:r>
-      <w:r>
-        <w:t>: GUID value must be same for form submit and page refresh before expires time.</w:t>
+        <w:t xml:space="preserve">   - </w:t>
+      </w:r>
+      <w:r>
+        <w:rPr>
+          <w:b/>
+          <w:bCs/>
+        </w:rPr>
+        <w:t>What you expected instead</w:t>
+      </w:r>
+      <w:r>
+        <w:t xml:space="preserve">: </w:t>
+      </w:r>
+      <w:r>
+        <w:t>The GUID value should remain unchanged after form submission and across page refreshes until the configured cache expiration time is reached.</w:t>
       </w:r>
     </w:p>
     <w:p>
       <w:r>
-        <w:lastRenderedPageBreak/>
-        <w:t xml:space="preserve">   - S</w:t>
-      </w:r>
-      <w:r>
-        <w:t>teps to reproduce</w:t>
+        <w:t xml:space="preserve">   - </w:t>
+      </w:r>
+      <w:r>
+        <w:rPr>
+          <w:b/>
+          <w:bCs/>
+        </w:rPr>
+        <w:t>Steps to reproduce</w:t>
       </w:r>
       <w:r>
         <w:t>:</w:t>
@@ -1000,10 +1116,27 @@
         <w:pStyle w:val="ListParagraph"/>
         <w:numPr>
           <w:ilvl w:val="0"/>
-          <w:numId w:val="2"/>
+          <w:numId w:val="5"/>
         </w:numPr>
-      </w:pPr>
-      <w:r>
+        <w:spacing w:after="0" w:line="300" w:lineRule="atLeast"/>
+        <w:rPr>
+          <w:rFonts w:ascii="Segoe UI" w:eastAsia="Times New Roman" w:hAnsi="Segoe UI" w:cs="Segoe UI"/>
+          <w:color w:val="000000"/>
+          <w:kern w:val="0"/>
+          <w:sz w:val="21"/>
+          <w:szCs w:val="21"/>
+          <w14:ligatures w14:val="none"/>
+        </w:rPr>
+      </w:pPr>
+      <w:r>
+        <w:rPr>
+          <w:rFonts w:ascii="Segoe UI" w:eastAsia="Times New Roman" w:hAnsi="Segoe UI" w:cs="Segoe UI"/>
+          <w:color w:val="000000"/>
+          <w:kern w:val="0"/>
+          <w:sz w:val="21"/>
+          <w:szCs w:val="21"/>
+          <w14:ligatures w14:val="none"/>
+        </w:rPr>
         <w:t>Refresh the page.</w:t>
       </w:r>
     </w:p>
@@ -1012,11 +1145,28 @@
         <w:pStyle w:val="ListParagraph"/>
         <w:numPr>
           <w:ilvl w:val="0"/>
-          <w:numId w:val="2"/>
+          <w:numId w:val="5"/>
         </w:numPr>
-      </w:pPr>
-      <w:r>
-        <w:t>Enter the any valid value in input.</w:t>
+        <w:spacing w:after="0" w:line="300" w:lineRule="atLeast"/>
+        <w:rPr>
+          <w:rFonts w:ascii="Segoe UI" w:eastAsia="Times New Roman" w:hAnsi="Segoe UI" w:cs="Segoe UI"/>
+          <w:color w:val="000000"/>
+          <w:kern w:val="0"/>
+          <w:sz w:val="21"/>
+          <w:szCs w:val="21"/>
+          <w14:ligatures w14:val="none"/>
+        </w:rPr>
+      </w:pPr>
+      <w:r>
+        <w:rPr>
+          <w:rFonts w:ascii="Segoe UI" w:eastAsia="Times New Roman" w:hAnsi="Segoe UI" w:cs="Segoe UI"/>
+          <w:color w:val="000000"/>
+          <w:kern w:val="0"/>
+          <w:sz w:val="21"/>
+          <w:szCs w:val="21"/>
+          <w14:ligatures w14:val="none"/>
+        </w:rPr>
+        <w:t>Enter any valid value in the input field.</w:t>
       </w:r>
     </w:p>
     <w:p>
@@ -1024,10 +1174,27 @@
         <w:pStyle w:val="ListParagraph"/>
         <w:numPr>
           <w:ilvl w:val="0"/>
-          <w:numId w:val="2"/>
+          <w:numId w:val="5"/>
         </w:numPr>
-      </w:pPr>
-      <w:r>
+        <w:spacing w:after="0" w:line="300" w:lineRule="atLeast"/>
+        <w:rPr>
+          <w:rFonts w:ascii="Segoe UI" w:eastAsia="Times New Roman" w:hAnsi="Segoe UI" w:cs="Segoe UI"/>
+          <w:color w:val="000000"/>
+          <w:kern w:val="0"/>
+          <w:sz w:val="21"/>
+          <w:szCs w:val="21"/>
+          <w14:ligatures w14:val="none"/>
+        </w:rPr>
+      </w:pPr>
+      <w:r>
+        <w:rPr>
+          <w:rFonts w:ascii="Segoe UI" w:eastAsia="Times New Roman" w:hAnsi="Segoe UI" w:cs="Segoe UI"/>
+          <w:color w:val="000000"/>
+          <w:kern w:val="0"/>
+          <w:sz w:val="21"/>
+          <w:szCs w:val="21"/>
+          <w14:ligatures w14:val="none"/>
+        </w:rPr>
         <w:t>Submit the form.</w:t>
       </w:r>
     </w:p>
@@ -1036,11 +1203,28 @@
         <w:pStyle w:val="ListParagraph"/>
         <w:numPr>
           <w:ilvl w:val="0"/>
-          <w:numId w:val="2"/>
+          <w:numId w:val="5"/>
         </w:numPr>
-      </w:pPr>
-      <w:r>
-        <w:t>You can see the GUID value has changed.</w:t>
+        <w:spacing w:after="0" w:line="300" w:lineRule="atLeast"/>
+        <w:rPr>
+          <w:rFonts w:ascii="Segoe UI" w:eastAsia="Times New Roman" w:hAnsi="Segoe UI" w:cs="Segoe UI"/>
+          <w:color w:val="000000"/>
+          <w:kern w:val="0"/>
+          <w:sz w:val="21"/>
+          <w:szCs w:val="21"/>
+          <w14:ligatures w14:val="none"/>
+        </w:rPr>
+      </w:pPr>
+      <w:r>
+        <w:rPr>
+          <w:rFonts w:ascii="Segoe UI" w:eastAsia="Times New Roman" w:hAnsi="Segoe UI" w:cs="Segoe UI"/>
+          <w:color w:val="000000"/>
+          <w:kern w:val="0"/>
+          <w:sz w:val="21"/>
+          <w:szCs w:val="21"/>
+          <w14:ligatures w14:val="none"/>
+        </w:rPr>
+        <w:t>Observe that the GUID value changes.</w:t>
       </w:r>
     </w:p>
     <w:p>
@@ -1048,36 +1232,98 @@
         <w:pStyle w:val="ListParagraph"/>
         <w:numPr>
           <w:ilvl w:val="0"/>
-          <w:numId w:val="2"/>
+          <w:numId w:val="5"/>
         </w:numPr>
-      </w:pPr>
-      <w:r>
-        <w:t>And refresh the page and every refresh action the GUID value will changed.</w:t>
+        <w:spacing w:after="0" w:line="300" w:lineRule="atLeast"/>
+        <w:rPr>
+          <w:rFonts w:ascii="Segoe UI" w:eastAsia="Times New Roman" w:hAnsi="Segoe UI" w:cs="Segoe UI"/>
+          <w:color w:val="000000"/>
+          <w:kern w:val="0"/>
+          <w:sz w:val="21"/>
+          <w:szCs w:val="21"/>
+          <w14:ligatures w14:val="none"/>
+        </w:rPr>
+      </w:pPr>
+      <w:r>
+        <w:rPr>
+          <w:rFonts w:ascii="Segoe UI" w:eastAsia="Times New Roman" w:hAnsi="Segoe UI" w:cs="Segoe UI"/>
+          <w:color w:val="000000"/>
+          <w:kern w:val="0"/>
+          <w:sz w:val="21"/>
+          <w:szCs w:val="21"/>
+          <w14:ligatures w14:val="none"/>
+        </w:rPr>
+        <w:t>Refresh the page again.</w:t>
       </w:r>
     </w:p>
     <w:p>
       <w:pPr>
+        <w:pStyle w:val="ListParagraph"/>
+        <w:numPr>
+          <w:ilvl w:val="0"/>
+          <w:numId w:val="5"/>
+        </w:numPr>
+        <w:spacing w:after="0" w:line="300" w:lineRule="atLeast"/>
+        <w:rPr>
+          <w:rFonts w:ascii="Segoe UI" w:eastAsia="Times New Roman" w:hAnsi="Segoe UI" w:cs="Segoe UI"/>
+          <w:color w:val="000000"/>
+          <w:kern w:val="0"/>
+          <w:sz w:val="21"/>
+          <w:szCs w:val="21"/>
+          <w14:ligatures w14:val="none"/>
+        </w:rPr>
+      </w:pPr>
+      <w:r>
+        <w:rPr>
+          <w:rFonts w:ascii="Segoe UI" w:eastAsia="Times New Roman" w:hAnsi="Segoe UI" w:cs="Segoe UI"/>
+          <w:color w:val="000000"/>
+          <w:kern w:val="0"/>
+          <w:sz w:val="21"/>
+          <w:szCs w:val="21"/>
+          <w14:ligatures w14:val="none"/>
+        </w:rPr>
+        <w:t>Observe that the GUID value changes on every page refresh, even before the cache expiration time is reached.</w:t>
+      </w:r>
+    </w:p>
+    <w:p>
+      <w:pPr>
+        <w:spacing w:after="0" w:line="300" w:lineRule="atLeast"/>
+        <w:rPr>
+          <w:rFonts w:ascii="Segoe UI" w:eastAsia="Times New Roman" w:hAnsi="Segoe UI" w:cs="Segoe UI"/>
+          <w:color w:val="000000"/>
+          <w:kern w:val="0"/>
+          <w:sz w:val="21"/>
+          <w:szCs w:val="21"/>
+          <w14:ligatures w14:val="none"/>
+        </w:rPr>
+      </w:pPr>
+    </w:p>
+    <w:p>
+      <w:pPr>
         <w:jc w:val="both"/>
       </w:pPr>
       <w:r>
-        <w:t xml:space="preserve">   - Evidence: </w:t>
-      </w:r>
-      <w:hyperlink r:id="rId23" w:history="1">
+        <w:t xml:space="preserve">   - </w:t>
+      </w:r>
+      <w:r>
+        <w:rPr>
+          <w:b/>
+          <w:bCs/>
+        </w:rPr>
+        <w:t>Evidence</w:t>
+      </w:r>
+      <w:r>
+        <w:t xml:space="preserve">: </w:t>
+      </w:r>
+      <w:hyperlink r:id="rId26" w:history="1">
         <w:r>
           <w:rPr>
             <w:rStyle w:val="Hyperlink"/>
           </w:rPr>
-          <w:t>L</w:t>
-        </w:r>
-        <w:r>
-          <w:rPr>
-            <w:rStyle w:val="Hyperlink"/>
-          </w:rPr>
-          <w:t>ink</w:t>
+          <w:t>Link</w:t>
         </w:r>
       </w:hyperlink>
     </w:p>
-    <w:p/>
     <w:sectPr>
       <w:pgSz w:w="12240" w:h="15840"/>
       <w:pgMar w:top="1440" w:right="1440" w:bottom="1440" w:left="1440" w:header="720" w:footer="720" w:gutter="0"/>
@@ -1240,6 +1486,118 @@
     </w:lvl>
   </w:abstractNum>
   <w:abstractNum w:abstractNumId="1" w15:restartNumberingAfterBreak="0">
+    <w:nsid w:val="34C41229"/>
+    <w:multiLevelType w:val="hybridMultilevel"/>
+    <w:tmpl w:val="0CFA3666"/>
+    <w:lvl w:ilvl="0" w:tplc="985449DC">
+      <w:numFmt w:val="bullet"/>
+      <w:lvlText w:val=""/>
+      <w:lvlJc w:val="left"/>
+      <w:pPr>
+        <w:ind w:left="1080" w:hanging="360"/>
+      </w:pPr>
+      <w:rPr>
+        <w:rFonts w:ascii="Symbol" w:eastAsia="Times New Roman" w:hAnsi="Symbol" w:cs="Segoe UI" w:hint="default"/>
+      </w:rPr>
+    </w:lvl>
+    <w:lvl w:ilvl="1" w:tplc="04090003" w:tentative="1">
+      <w:start w:val="1"/>
+      <w:numFmt w:val="bullet"/>
+      <w:lvlText w:val="o"/>
+      <w:lvlJc w:val="left"/>
+      <w:pPr>
+        <w:ind w:left="1800" w:hanging="360"/>
+      </w:pPr>
+      <w:rPr>
+        <w:rFonts w:ascii="Courier New" w:hAnsi="Courier New" w:cs="Courier New" w:hint="default"/>
+      </w:rPr>
+    </w:lvl>
+    <w:lvl w:ilvl="2" w:tplc="04090005" w:tentative="1">
+      <w:start w:val="1"/>
+      <w:numFmt w:val="bullet"/>
+      <w:lvlText w:val=""/>
+      <w:lvlJc w:val="left"/>
+      <w:pPr>
+        <w:ind w:left="2520" w:hanging="360"/>
+      </w:pPr>
+      <w:rPr>
+        <w:rFonts w:ascii="Wingdings" w:hAnsi="Wingdings" w:hint="default"/>
+      </w:rPr>
+    </w:lvl>
+    <w:lvl w:ilvl="3" w:tplc="04090001" w:tentative="1">
+      <w:start w:val="1"/>
+      <w:numFmt w:val="bullet"/>
+      <w:lvlText w:val=""/>
+      <w:lvlJc w:val="left"/>
+      <w:pPr>
+        <w:ind w:left="3240" w:hanging="360"/>
+      </w:pPr>
+      <w:rPr>
+        <w:rFonts w:ascii="Symbol" w:hAnsi="Symbol" w:hint="default"/>
+      </w:rPr>
+    </w:lvl>
+    <w:lvl w:ilvl="4" w:tplc="04090003" w:tentative="1">
+      <w:start w:val="1"/>
+      <w:numFmt w:val="bullet"/>
+      <w:lvlText w:val="o"/>
+      <w:lvlJc w:val="left"/>
+      <w:pPr>
+        <w:ind w:left="3960" w:hanging="360"/>
+      </w:pPr>
+      <w:rPr>
+        <w:rFonts w:ascii="Courier New" w:hAnsi="Courier New" w:cs="Courier New" w:hint="default"/>
+      </w:rPr>
+    </w:lvl>
+    <w:lvl w:ilvl="5" w:tplc="04090005" w:tentative="1">
+      <w:start w:val="1"/>
+      <w:numFmt w:val="bullet"/>
+      <w:lvlText w:val=""/>
+      <w:lvlJc w:val="left"/>
+      <w:pPr>
+        <w:ind w:left="4680" w:hanging="360"/>
+      </w:pPr>
+      <w:rPr>
+        <w:rFonts w:ascii="Wingdings" w:hAnsi="Wingdings" w:hint="default"/>
+      </w:rPr>
+    </w:lvl>
+    <w:lvl w:ilvl="6" w:tplc="04090001" w:tentative="1">
+      <w:start w:val="1"/>
+      <w:numFmt w:val="bullet"/>
+      <w:lvlText w:val=""/>
+      <w:lvlJc w:val="left"/>
+      <w:pPr>
+        <w:ind w:left="5400" w:hanging="360"/>
+      </w:pPr>
+      <w:rPr>
+        <w:rFonts w:ascii="Symbol" w:hAnsi="Symbol" w:hint="default"/>
+      </w:rPr>
+    </w:lvl>
+    <w:lvl w:ilvl="7" w:tplc="04090003" w:tentative="1">
+      <w:start w:val="1"/>
+      <w:numFmt w:val="bullet"/>
+      <w:lvlText w:val="o"/>
+      <w:lvlJc w:val="left"/>
+      <w:pPr>
+        <w:ind w:left="6120" w:hanging="360"/>
+      </w:pPr>
+      <w:rPr>
+        <w:rFonts w:ascii="Courier New" w:hAnsi="Courier New" w:cs="Courier New" w:hint="default"/>
+      </w:rPr>
+    </w:lvl>
+    <w:lvl w:ilvl="8" w:tplc="04090005" w:tentative="1">
+      <w:start w:val="1"/>
+      <w:numFmt w:val="bullet"/>
+      <w:lvlText w:val=""/>
+      <w:lvlJc w:val="left"/>
+      <w:pPr>
+        <w:ind w:left="6840" w:hanging="360"/>
+      </w:pPr>
+      <w:rPr>
+        <w:rFonts w:ascii="Wingdings" w:hAnsi="Wingdings" w:hint="default"/>
+      </w:rPr>
+    </w:lvl>
+  </w:abstractNum>
+  <w:abstractNum w:abstractNumId="2" w15:restartNumberingAfterBreak="0">
     <w:nsid w:val="4D4D5273"/>
     <w:multiLevelType w:val="hybridMultilevel"/>
     <w:tmpl w:val="89A287CE"/>
@@ -1323,13 +1681,221 @@
       <w:pPr>
         <w:ind w:left="6480" w:hanging="180"/>
       </w:pPr>
+    </w:lvl>
+  </w:abstractNum>
+  <w:abstractNum w:abstractNumId="3" w15:restartNumberingAfterBreak="0">
+    <w:nsid w:val="64CE0FFF"/>
+    <w:multiLevelType w:val="hybridMultilevel"/>
+    <w:tmpl w:val="AE7AF084"/>
+    <w:lvl w:ilvl="0" w:tplc="0409000F">
+      <w:start w:val="1"/>
+      <w:numFmt w:val="decimal"/>
+      <w:lvlText w:val="%1."/>
+      <w:lvlJc w:val="left"/>
+      <w:pPr>
+        <w:ind w:left="720" w:hanging="360"/>
+      </w:pPr>
+    </w:lvl>
+    <w:lvl w:ilvl="1" w:tplc="04090019" w:tentative="1">
+      <w:start w:val="1"/>
+      <w:numFmt w:val="lowerLetter"/>
+      <w:lvlText w:val="%2."/>
+      <w:lvlJc w:val="left"/>
+      <w:pPr>
+        <w:ind w:left="1440" w:hanging="360"/>
+      </w:pPr>
+    </w:lvl>
+    <w:lvl w:ilvl="2" w:tplc="0409001B" w:tentative="1">
+      <w:start w:val="1"/>
+      <w:numFmt w:val="lowerRoman"/>
+      <w:lvlText w:val="%3."/>
+      <w:lvlJc w:val="right"/>
+      <w:pPr>
+        <w:ind w:left="2160" w:hanging="180"/>
+      </w:pPr>
+    </w:lvl>
+    <w:lvl w:ilvl="3" w:tplc="0409000F" w:tentative="1">
+      <w:start w:val="1"/>
+      <w:numFmt w:val="decimal"/>
+      <w:lvlText w:val="%4."/>
+      <w:lvlJc w:val="left"/>
+      <w:pPr>
+        <w:ind w:left="2880" w:hanging="360"/>
+      </w:pPr>
+    </w:lvl>
+    <w:lvl w:ilvl="4" w:tplc="04090019" w:tentative="1">
+      <w:start w:val="1"/>
+      <w:numFmt w:val="lowerLetter"/>
+      <w:lvlText w:val="%5."/>
+      <w:lvlJc w:val="left"/>
+      <w:pPr>
+        <w:ind w:left="3600" w:hanging="360"/>
+      </w:pPr>
+    </w:lvl>
+    <w:lvl w:ilvl="5" w:tplc="0409001B" w:tentative="1">
+      <w:start w:val="1"/>
+      <w:numFmt w:val="lowerRoman"/>
+      <w:lvlText w:val="%6."/>
+      <w:lvlJc w:val="right"/>
+      <w:pPr>
+        <w:ind w:left="4320" w:hanging="180"/>
+      </w:pPr>
+    </w:lvl>
+    <w:lvl w:ilvl="6" w:tplc="0409000F" w:tentative="1">
+      <w:start w:val="1"/>
+      <w:numFmt w:val="decimal"/>
+      <w:lvlText w:val="%7."/>
+      <w:lvlJc w:val="left"/>
+      <w:pPr>
+        <w:ind w:left="5040" w:hanging="360"/>
+      </w:pPr>
+    </w:lvl>
+    <w:lvl w:ilvl="7" w:tplc="04090019" w:tentative="1">
+      <w:start w:val="1"/>
+      <w:numFmt w:val="lowerLetter"/>
+      <w:lvlText w:val="%8."/>
+      <w:lvlJc w:val="left"/>
+      <w:pPr>
+        <w:ind w:left="5760" w:hanging="360"/>
+      </w:pPr>
+    </w:lvl>
+    <w:lvl w:ilvl="8" w:tplc="0409001B" w:tentative="1">
+      <w:start w:val="1"/>
+      <w:numFmt w:val="lowerRoman"/>
+      <w:lvlText w:val="%9."/>
+      <w:lvlJc w:val="right"/>
+      <w:pPr>
+        <w:ind w:left="6480" w:hanging="180"/>
+      </w:pPr>
+    </w:lvl>
+  </w:abstractNum>
+  <w:abstractNum w:abstractNumId="4" w15:restartNumberingAfterBreak="0">
+    <w:nsid w:val="6BA15C1C"/>
+    <w:multiLevelType w:val="hybridMultilevel"/>
+    <w:tmpl w:val="D8DE52C6"/>
+    <w:lvl w:ilvl="0" w:tplc="04090001">
+      <w:start w:val="1"/>
+      <w:numFmt w:val="bullet"/>
+      <w:lvlText w:val=""/>
+      <w:lvlJc w:val="left"/>
+      <w:pPr>
+        <w:ind w:left="1440" w:hanging="360"/>
+      </w:pPr>
+      <w:rPr>
+        <w:rFonts w:ascii="Symbol" w:hAnsi="Symbol" w:hint="default"/>
+      </w:rPr>
+    </w:lvl>
+    <w:lvl w:ilvl="1" w:tplc="04090003" w:tentative="1">
+      <w:start w:val="1"/>
+      <w:numFmt w:val="bullet"/>
+      <w:lvlText w:val="o"/>
+      <w:lvlJc w:val="left"/>
+      <w:pPr>
+        <w:ind w:left="2160" w:hanging="360"/>
+      </w:pPr>
+      <w:rPr>
+        <w:rFonts w:ascii="Courier New" w:hAnsi="Courier New" w:cs="Courier New" w:hint="default"/>
+      </w:rPr>
+    </w:lvl>
+    <w:lvl w:ilvl="2" w:tplc="04090005" w:tentative="1">
+      <w:start w:val="1"/>
+      <w:numFmt w:val="bullet"/>
+      <w:lvlText w:val=""/>
+      <w:lvlJc w:val="left"/>
+      <w:pPr>
+        <w:ind w:left="2880" w:hanging="360"/>
+      </w:pPr>
+      <w:rPr>
+        <w:rFonts w:ascii="Wingdings" w:hAnsi="Wingdings" w:hint="default"/>
+      </w:rPr>
+    </w:lvl>
+    <w:lvl w:ilvl="3" w:tplc="04090001" w:tentative="1">
+      <w:start w:val="1"/>
+      <w:numFmt w:val="bullet"/>
+      <w:lvlText w:val=""/>
+      <w:lvlJc w:val="left"/>
+      <w:pPr>
+        <w:ind w:left="3600" w:hanging="360"/>
+      </w:pPr>
+      <w:rPr>
+        <w:rFonts w:ascii="Symbol" w:hAnsi="Symbol" w:hint="default"/>
+      </w:rPr>
+    </w:lvl>
+    <w:lvl w:ilvl="4" w:tplc="04090003" w:tentative="1">
+      <w:start w:val="1"/>
+      <w:numFmt w:val="bullet"/>
+      <w:lvlText w:val="o"/>
+      <w:lvlJc w:val="left"/>
+      <w:pPr>
+        <w:ind w:left="4320" w:hanging="360"/>
+      </w:pPr>
+      <w:rPr>
+        <w:rFonts w:ascii="Courier New" w:hAnsi="Courier New" w:cs="Courier New" w:hint="default"/>
+      </w:rPr>
+    </w:lvl>
+    <w:lvl w:ilvl="5" w:tplc="04090005" w:tentative="1">
+      <w:start w:val="1"/>
+      <w:numFmt w:val="bullet"/>
+      <w:lvlText w:val=""/>
+      <w:lvlJc w:val="left"/>
+      <w:pPr>
+        <w:ind w:left="5040" w:hanging="360"/>
+      </w:pPr>
+      <w:rPr>
+        <w:rFonts w:ascii="Wingdings" w:hAnsi="Wingdings" w:hint="default"/>
+      </w:rPr>
+    </w:lvl>
+    <w:lvl w:ilvl="6" w:tplc="04090001" w:tentative="1">
+      <w:start w:val="1"/>
+      <w:numFmt w:val="bullet"/>
+      <w:lvlText w:val=""/>
+      <w:lvlJc w:val="left"/>
+      <w:pPr>
+        <w:ind w:left="5760" w:hanging="360"/>
+      </w:pPr>
+      <w:rPr>
+        <w:rFonts w:ascii="Symbol" w:hAnsi="Symbol" w:hint="default"/>
+      </w:rPr>
+    </w:lvl>
+    <w:lvl w:ilvl="7" w:tplc="04090003" w:tentative="1">
+      <w:start w:val="1"/>
+      <w:numFmt w:val="bullet"/>
+      <w:lvlText w:val="o"/>
+      <w:lvlJc w:val="left"/>
+      <w:pPr>
+        <w:ind w:left="6480" w:hanging="360"/>
+      </w:pPr>
+      <w:rPr>
+        <w:rFonts w:ascii="Courier New" w:hAnsi="Courier New" w:cs="Courier New" w:hint="default"/>
+      </w:rPr>
+    </w:lvl>
+    <w:lvl w:ilvl="8" w:tplc="04090005" w:tentative="1">
+      <w:start w:val="1"/>
+      <w:numFmt w:val="bullet"/>
+      <w:lvlText w:val=""/>
+      <w:lvlJc w:val="left"/>
+      <w:pPr>
+        <w:ind w:left="7200" w:hanging="360"/>
+      </w:pPr>
+      <w:rPr>
+        <w:rFonts w:ascii="Wingdings" w:hAnsi="Wingdings" w:hint="default"/>
+      </w:rPr>
     </w:lvl>
   </w:abstractNum>
   <w:num w:numId="1" w16cid:durableId="1289164866">
     <w:abstractNumId w:val="0"/>
   </w:num>
   <w:num w:numId="2" w16cid:durableId="1114398384">
+    <w:abstractNumId w:val="2"/>
+  </w:num>
+  <w:num w:numId="3" w16cid:durableId="724182974">
+    <w:abstractNumId w:val="4"/>
+  </w:num>
+  <w:num w:numId="4" w16cid:durableId="786580839">
     <w:abstractNumId w:val="1"/>
+  </w:num>
+  <w:num w:numId="5" w16cid:durableId="1247038417">
+    <w:abstractNumId w:val="3"/>
   </w:num>
 </w:numbering>
 </file>

</xml_diff>